<commit_message>
Fix: Clean API key (remove BOM) + update model list to use gemini-2.5-flash
</commit_message>
<xml_diff>
--- a/Daily Reports/09_07_2026-CBOT Reports.docx
+++ b/Daily Reports/09_07_2026-CBOT Reports.docx
@@ -104,7 +104,7 @@
           <w:color w:val="5C768D"/>
           <w:sz w:val="19"/>
         </w:rPr>
-        <w:t>Cập nhật tự động qua `macro_tracker.py` vào lúc 09:16 ICT ngày 09/07/2026</w:t>
+        <w:t>Cập nhật tự động qua `macro_tracker.py` vào lúc 22:16 ICT ngày 09/07/2026</w:t>
       </w:r>
     </w:p>
     <w:tbl>
@@ -1256,7 +1256,7 @@
         <w:rPr>
           <w:b/>
         </w:rPr>
-        <w:t>`606.00` (-0.49%)</w:t>
+        <w:t>`619.00` (-0.49%)</w:t>
       </w:r>
       <w:r>
         <w:t>.</w:t>
@@ -1326,7 +1326,7 @@
           <w:color w:val="5C768D"/>
           <w:sz w:val="19"/>
         </w:rPr>
-        <w:t>Cập nhật tự động lúc 09:16 ICT ngày 09/07/2026 — Nguồn: NOAA, USDA, BOM Australia</w:t>
+        <w:t>Cập nhật tự động lúc 22:16 ICT ngày 09/07/2026 — Nguồn: NOAA, USDA, BOM Australia</w:t>
       </w:r>
     </w:p>
     <w:p>
@@ -3594,7 +3594,7 @@
               <w:rPr>
                 <w:b/>
               </w:rPr>
-              <w:t>431.75</w:t>
+              <w:t>433.50</w:t>
             </w:r>
           </w:p>
         </w:tc>
@@ -3625,7 +3625,7 @@
               <w:rPr>
                 <w:b/>
               </w:rPr>
-              <w:t>434.79 (+3.04)</w:t>
+              <w:t>435.60 (+2.10)</w:t>
             </w:r>
           </w:p>
         </w:tc>
@@ -3653,7 +3653,7 @@
             </w:pPr>
             <w:r/>
             <w:r>
-              <w:t>Bullish (437.12 &gt; 436.44)</w:t>
+              <w:t>Bearish (433.01 &lt; 434.31)</w:t>
             </w:r>
           </w:p>
         </w:tc>
@@ -3681,7 +3681,7 @@
             </w:pPr>
             <w:r/>
             <w:r>
-              <w:t>0.75 cents</w:t>
+              <w:t>1.00 cents</w:t>
             </w:r>
           </w:p>
         </w:tc>
@@ -3842,7 +3842,7 @@
               <w:rPr>
                 <w:b/>
               </w:rPr>
-              <w:t>606.00</w:t>
+              <w:t>619.00</w:t>
             </w:r>
           </w:p>
         </w:tc>
@@ -3873,7 +3873,7 @@
               <w:rPr>
                 <w:b/>
               </w:rPr>
-              <w:t>609.15 (+3.15)</w:t>
+              <w:t>619.72 (+0.72)</w:t>
             </w:r>
           </w:p>
         </w:tc>
@@ -3901,7 +3901,7 @@
             </w:pPr>
             <w:r/>
             <w:r>
-              <w:t>Bullish (612.95 &gt; 612.30)</w:t>
+              <w:t>Bearish (610.12 &lt; 610.60)</w:t>
             </w:r>
           </w:p>
         </w:tc>
@@ -3929,7 +3929,7 @@
             </w:pPr>
             <w:r/>
             <w:r>
-              <w:t>0.00 cents</w:t>
+              <w:t>1.50 cents</w:t>
             </w:r>
           </w:p>
         </w:tc>
@@ -4367,7 +4367,7 @@
                 <w:b/>
                 <w:color w:val="15803D"/>
               </w:rPr>
-              <w:t>429.00 - 437.12 cents (Canh mua vùng hỗ trợ)</w:t>
+              <w:t>429.75 - 433.01 cents (Canh mua vùng hỗ trợ)</w:t>
             </w:r>
           </w:p>
         </w:tc>
@@ -4398,7 +4398,7 @@
               <w:rPr>
                 <w:b/>
               </w:rPr>
-              <w:t>403.21 cents (Dưới cản S2 + 1.5x ATR)</w:t>
+              <w:t>402.63 cents (Dưới cản S2 + 1.5x ATR)</w:t>
             </w:r>
           </w:p>
         </w:tc>
@@ -4434,7 +4434,7 @@
                 <w:color w:val="D97706"/>
                 <w:sz w:val="19"/>
               </w:rPr>
-              <w:t xml:space="preserve"> 433.25 cents </w:t>
+              <w:t xml:space="preserve"> 437.75 cents </w:t>
             </w:r>
             <w:r>
               <w:t xml:space="preserve"> / TP2: </w:t>
@@ -4445,7 +4445,7 @@
                 <w:color w:val="D97706"/>
                 <w:sz w:val="19"/>
               </w:rPr>
-              <w:t xml:space="preserve"> 451.75 cents </w:t>
+              <w:t xml:space="preserve"> 450.00 cents </w:t>
             </w:r>
           </w:p>
         </w:tc>
@@ -4548,7 +4548,7 @@
                 <w:b/>
                 <w:color w:val="15803D"/>
               </w:rPr>
-              <w:t>Long trung hạn (Swing) (ZCU26)</w:t>
+              <w:t>Long trung hạn (Swing) (ZCZ26)</w:t>
             </w:r>
           </w:p>
         </w:tc>
@@ -4579,7 +4579,7 @@
               <w:rPr>
                 <w:b/>
               </w:rPr>
-              <w:t>427.50 - 429.00 cents</w:t>
+              <w:t>451.50 - 453.00 cents</w:t>
             </w:r>
           </w:p>
         </w:tc>
@@ -4610,7 +4610,7 @@
               <w:rPr>
                 <w:b/>
               </w:rPr>
-              <w:t>404.22 cents (Chống quét SL tuyệt đối)</w:t>
+              <w:t>423.36 cents (Chống quét SL tuyệt đối)</w:t>
             </w:r>
           </w:p>
         </w:tc>
@@ -4641,7 +4641,7 @@
               <w:rPr>
                 <w:b/>
               </w:rPr>
-              <w:t>450.75 cents (Ăn trọn biên độ ngô ~10.5 giá)</w:t>
+              <w:t>467.75 cents (Ăn trọn biên độ ngô ~10.5 giá)</w:t>
             </w:r>
           </w:p>
         </w:tc>
@@ -4741,7 +4741,7 @@
                 <w:b/>
                 <w:color w:val="B91C1C"/>
               </w:rPr>
-              <w:t>Short trung hạn (Swing) (ZCU26)</w:t>
+              <w:t>Short trung hạn (Swing) (ZCZ26)</w:t>
             </w:r>
           </w:p>
         </w:tc>
@@ -4772,7 +4772,7 @@
               <w:rPr>
                 <w:b/>
               </w:rPr>
-              <w:t>433.25 - 434.75 cents</w:t>
+              <w:t>457.25 - 458.75 cents</w:t>
             </w:r>
           </w:p>
         </w:tc>
@@ -4803,7 +4803,7 @@
               <w:rPr>
                 <w:b/>
               </w:rPr>
-              <w:t>435.28 cents</w:t>
+              <w:t>459.64 cents</w:t>
             </w:r>
           </w:p>
         </w:tc>
@@ -4834,7 +4834,7 @@
               <w:rPr>
                 <w:b/>
               </w:rPr>
-              <w:t>407.25 cents</w:t>
+              <w:t>426.75 cents</w:t>
             </w:r>
           </w:p>
         </w:tc>
@@ -4965,7 +4965,7 @@
               <w:rPr>
                 <w:b/>
               </w:rPr>
-              <w:t>418.01 - 425.75 cents</w:t>
+              <w:t>416.19 - 425.75 cents</w:t>
             </w:r>
           </w:p>
         </w:tc>
@@ -5146,7 +5146,7 @@
                 <w:b/>
                 <w:color w:val="B91C1C"/>
               </w:rPr>
-              <w:t>612.95 - 612.30 cents (Canh bán hồi kỹ thuật H1)</w:t>
+              <w:t>610.12 - 610.60 cents (Canh bán hồi kỹ thuật H1)</w:t>
             </w:r>
           </w:p>
         </w:tc>
@@ -5177,7 +5177,7 @@
               <w:rPr>
                 <w:b/>
               </w:rPr>
-              <w:t>631.75 cents (Trên kháng cự R2 + 1.5x ATR)</w:t>
+              <w:t>633.10 cents (Trên kháng cự R2 + 1.5x ATR)</w:t>
             </w:r>
           </w:p>
         </w:tc>
@@ -5213,7 +5213,7 @@
                 <w:color w:val="D97706"/>
                 <w:sz w:val="19"/>
               </w:rPr>
-              <w:t xml:space="preserve"> 602.75 cents </w:t>
+              <w:t xml:space="preserve"> 614.50 cents </w:t>
             </w:r>
             <w:r>
               <w:t xml:space="preserve"> / TP2: </w:t>
@@ -5355,7 +5355,7 @@
               <w:rPr>
                 <w:b/>
               </w:rPr>
-              <w:t>600.75 - 602.75 cents</w:t>
+              <w:t>612.50 - 614.50 cents</w:t>
             </w:r>
           </w:p>
         </w:tc>
@@ -5386,7 +5386,7 @@
               <w:rPr>
                 <w:b/>
               </w:rPr>
-              <w:t>570.84 cents</w:t>
+              <w:t>569.93 cents</w:t>
             </w:r>
           </w:p>
         </w:tc>
@@ -5417,7 +5417,7 @@
               <w:rPr>
                 <w:b/>
               </w:rPr>
-              <w:t>607.75 cents (Đón sóng hồi trung hạn ~14.5 giá)</w:t>
+              <w:t>624.00 cents (Đón sóng hồi trung hạn ~14.5 giá)</w:t>
             </w:r>
           </w:p>
         </w:tc>
@@ -5548,7 +5548,7 @@
               <w:rPr>
                 <w:b/>
               </w:rPr>
-              <w:t>607.75 - 609.75 cents</w:t>
+              <w:t>624.00 - 626.00 cents</w:t>
             </w:r>
           </w:p>
         </w:tc>
@@ -5579,7 +5579,7 @@
               <w:rPr>
                 <w:b/>
               </w:rPr>
-              <w:t>610.91 cents</w:t>
+              <w:t>628.07 cents</w:t>
             </w:r>
           </w:p>
         </w:tc>
@@ -5741,7 +5741,7 @@
               <w:rPr>
                 <w:b/>
               </w:rPr>
-              <w:t>578.55 - 590.50 cents</w:t>
+              <w:t>575.28 - 590.50 cents</w:t>
             </w:r>
           </w:p>
         </w:tc>
@@ -11550,7 +11550,7 @@
               <w:rPr>
                 <w:b/>
               </w:rPr>
-              <w:t>Tăng (Bullish)</w:t>
+              <w:t>Giảm (Bearish)</w:t>
             </w:r>
           </w:p>
         </w:tc>
@@ -11578,7 +11578,7 @@
             </w:pPr>
             <w:r/>
             <w:r>
-              <w:t>EMA_21 H1 &gt; EMA_50 H1 (Hội tụ động lượng tăng)</w:t>
+              <w:t>EMA_21 H1 &lt; EMA_50 H1 (Áp lực bán duy trì)</w:t>
             </w:r>
           </w:p>
         </w:tc>
@@ -11629,7 +11629,7 @@
         <w:t>Giá Chốt Phiên (Close):</w:t>
       </w:r>
       <w:r>
-        <w:t xml:space="preserve"> 431.75 cents | </w:t>
+        <w:t xml:space="preserve"> 433.50 cents | </w:t>
       </w:r>
       <w:r>
         <w:rPr>
@@ -11644,10 +11644,10 @@
         <w:rPr>
           <w:b/>
         </w:rPr>
-        <w:t>`434.79 cents`</w:t>
+        <w:t>`435.60 cents`</w:t>
       </w:r>
       <w:r>
-        <w:t xml:space="preserve"> (+3.04).</w:t>
+        <w:t xml:space="preserve"> (+2.10).</w:t>
       </w:r>
     </w:p>
     <w:p>
@@ -11668,7 +11668,7 @@
         <w:rPr>
           <w:b/>
         </w:rPr>
-        <w:t>`7,067`</w:t>
+        <w:t>`60,161`</w:t>
       </w:r>
       <w:r>
         <w:t xml:space="preserve"> (Chênh lệch: </w:t>
@@ -11677,7 +11677,7 @@
         <w:rPr>
           <w:b/>
         </w:rPr>
-        <w:t>`-157,929`</w:t>
+        <w:t>`-104,835`</w:t>
       </w:r>
       <w:r>
         <w:t xml:space="preserve">) | OI: </w:t>
@@ -11686,7 +11686,7 @@
         <w:rPr>
           <w:b/>
         </w:rPr>
-        <w:t>`633,343`</w:t>
+        <w:t>`633,345`</w:t>
       </w:r>
       <w:r>
         <w:t xml:space="preserve"> (Chênh lệch: </w:t>
@@ -11695,7 +11695,7 @@
         <w:rPr>
           <w:b/>
         </w:rPr>
-        <w:t>`-7,776`</w:t>
+        <w:t>`+2`</w:t>
       </w:r>
       <w:r>
         <w:t>)</w:t>
@@ -11739,9 +11739,8 @@
       <w:r>
         <w:rPr>
           <w:b/>
-          <w:color w:val="15803D"/>
         </w:rPr>
-        <w:t>`Giảm suy yếu / Đáy ngắn hạn (Long Liquidation Decline)`</w:t>
+        <w:t>`Giảm nhẹ tích lũy (Distribution Decline)`</w:t>
       </w:r>
     </w:p>
     <w:p>
@@ -12779,7 +12778,7 @@
         <w:t xml:space="preserve"> EMA_21 </w:t>
       </w:r>
       <w:r>
-        <w:t xml:space="preserve"> (437.12) &gt; </w:t>
+        <w:t xml:space="preserve"> (433.01) &lt; </w:t>
       </w:r>
       <w:r>
         <w:rPr>
@@ -12790,7 +12789,7 @@
         <w:t xml:space="preserve"> EMA_50 </w:t>
       </w:r>
       <w:r>
-        <w:t xml:space="preserve"> (436.44).</w:t>
+        <w:t xml:space="preserve"> (434.31).</w:t>
       </w:r>
     </w:p>
     <w:p>
@@ -12811,7 +12810,7 @@
         <w:rPr>
           <w:b/>
         </w:rPr>
-        <w:t>`28.87`</w:t>
+        <w:t>`49.50`</w:t>
       </w:r>
       <w:r>
         <w:t xml:space="preserve"> | ATR (14) = </w:t>
@@ -12820,7 +12819,7 @@
         <w:rPr>
           <w:b/>
         </w:rPr>
-        <w:t>`2.03`</w:t>
+        <w:t>`2.41`</w:t>
       </w:r>
       <w:r>
         <w:t xml:space="preserve"> cents | Volatility = </w:t>
@@ -12829,7 +12828,7 @@
         <w:rPr>
           <w:b/>
         </w:rPr>
-        <w:t>`0.75 cents`</w:t>
+        <w:t>`1.00 cents`</w:t>
       </w:r>
       <w:r>
         <w:t>.</w:t>
@@ -12853,7 +12852,7 @@
         <w:rPr>
           <w:b/>
         </w:rPr>
-        <w:t>`429.00`</w:t>
+        <w:t>`429.75`</w:t>
       </w:r>
       <w:r>
         <w:t xml:space="preserve"> | S2: </w:t>
@@ -12871,7 +12870,7 @@
         <w:rPr>
           <w:b/>
         </w:rPr>
-        <w:t>`433.25`</w:t>
+        <w:t>`437.75`</w:t>
       </w:r>
       <w:r>
         <w:t xml:space="preserve"> | R2: </w:t>
@@ -12880,7 +12879,7 @@
         <w:rPr>
           <w:b/>
         </w:rPr>
-        <w:t>`451.75`</w:t>
+        <w:t>`450.00`</w:t>
       </w:r>
     </w:p>
     <w:p>
@@ -13614,7 +13613,7 @@
           <w:b/>
           <w:color w:val="15803D"/>
         </w:rPr>
-        <w:t>`429.00 - 437.12 cents (Canh mua vùng hỗ trợ)`</w:t>
+        <w:t>`429.75 - 433.01 cents (Canh mua vùng hỗ trợ)`</w:t>
       </w:r>
       <w:r>
         <w:t xml:space="preserve"> | SL: </w:t>
@@ -13623,7 +13622,7 @@
         <w:rPr>
           <w:b/>
         </w:rPr>
-        <w:t>`403.21 cents (Dưới cản S2 + 1.5x ATR)`</w:t>
+        <w:t>`402.63 cents (Dưới cản S2 + 1.5x ATR)`</w:t>
       </w:r>
       <w:r>
         <w:t xml:space="preserve"> | TP: </w:t>
@@ -13634,7 +13633,7 @@
           <w:color w:val="D97706"/>
           <w:sz w:val="19"/>
         </w:rPr>
-        <w:t xml:space="preserve"> 433.25 cents </w:t>
+        <w:t xml:space="preserve"> 437.75 cents </w:t>
       </w:r>
       <w:r>
         <w:t xml:space="preserve"> / </w:t>
@@ -13645,7 +13644,7 @@
           <w:color w:val="D97706"/>
           <w:sz w:val="19"/>
         </w:rPr>
-        <w:t xml:space="preserve"> 451.75 cents </w:t>
+        <w:t xml:space="preserve"> 450.00 cents </w:t>
       </w:r>
       <w:r>
         <w:t>.</w:t>
@@ -13660,7 +13659,7 @@
         <w:rPr>
           <w:b/>
         </w:rPr>
-        <w:t>Trung hạn (Swing Trades - HĐ ZCU26):</w:t>
+        <w:t>Trung hạn (Swing Trades - HĐ ZCZ26):</w:t>
       </w:r>
     </w:p>
     <w:p>
@@ -13685,7 +13684,7 @@
         <w:rPr>
           <w:b/>
         </w:rPr>
-        <w:t>`427.50 - 429.00 cents`</w:t>
+        <w:t>`451.50 - 453.00 cents`</w:t>
       </w:r>
       <w:r>
         <w:t xml:space="preserve"> | SL: </w:t>
@@ -13694,7 +13693,7 @@
         <w:rPr>
           <w:b/>
         </w:rPr>
-        <w:t>`404.22 cents (Chống quét SL tuyệt đối)`</w:t>
+        <w:t>`423.36 cents (Chống quét SL tuyệt đối)`</w:t>
       </w:r>
       <w:r>
         <w:t xml:space="preserve"> | TP: </w:t>
@@ -13703,7 +13702,7 @@
         <w:rPr>
           <w:b/>
         </w:rPr>
-        <w:t>`450.75 cents (Ăn trọn biên độ ngô ~10.5 giá)`</w:t>
+        <w:t>`467.75 cents (Ăn trọn biên độ ngô ~10.5 giá)`</w:t>
       </w:r>
       <w:r>
         <w:t>.</w:t>
@@ -13731,7 +13730,7 @@
         <w:rPr>
           <w:b/>
         </w:rPr>
-        <w:t>`433.25 - 434.75 cents`</w:t>
+        <w:t>`457.25 - 458.75 cents`</w:t>
       </w:r>
       <w:r>
         <w:t xml:space="preserve"> | SL: </w:t>
@@ -13740,7 +13739,7 @@
         <w:rPr>
           <w:b/>
         </w:rPr>
-        <w:t>`435.28 cents`</w:t>
+        <w:t>`459.64 cents`</w:t>
       </w:r>
       <w:r>
         <w:t xml:space="preserve"> | TP: </w:t>
@@ -13749,7 +13748,7 @@
         <w:rPr>
           <w:b/>
         </w:rPr>
-        <w:t>`407.25 cents`</w:t>
+        <w:t>`426.75 cents`</w:t>
       </w:r>
       <w:r>
         <w:t>.</w:t>
@@ -13789,7 +13788,7 @@
         <w:rPr>
           <w:b/>
         </w:rPr>
-        <w:t>`418.01 - 425.75 cents`</w:t>
+        <w:t>`416.19 - 425.75 cents`</w:t>
       </w:r>
     </w:p>
     <w:p>
@@ -14196,7 +14195,7 @@
             </w:pPr>
             <w:r/>
             <w:r>
-              <w:t>431.75</w:t>
+              <w:t>433.50</w:t>
             </w:r>
           </w:p>
         </w:tc>
@@ -14224,7 +14223,7 @@
             </w:pPr>
             <w:r/>
             <w:r>
-              <w:t>435.50</w:t>
+              <w:t>437.25</w:t>
             </w:r>
           </w:p>
         </w:tc>
@@ -14252,7 +14251,7 @@
             </w:pPr>
             <w:r/>
             <w:r>
-              <w:t>428.50</w:t>
+              <w:t>430.25</w:t>
             </w:r>
           </w:p>
         </w:tc>
@@ -14283,7 +14282,7 @@
               <w:rPr>
                 <w:b/>
               </w:rPr>
-              <w:t>432.00</w:t>
+              <w:t>433.75</w:t>
             </w:r>
           </w:p>
         </w:tc>
@@ -14431,7 +14430,7 @@
             </w:pPr>
             <w:r/>
             <w:r>
-              <w:t>432.00</w:t>
+              <w:t>433.75</w:t>
             </w:r>
           </w:p>
         </w:tc>
@@ -14459,7 +14458,7 @@
             </w:pPr>
             <w:r/>
             <w:r>
-              <w:t>434.75</w:t>
+              <w:t>436.50</w:t>
             </w:r>
           </w:p>
         </w:tc>
@@ -14487,7 +14486,7 @@
             </w:pPr>
             <w:r/>
             <w:r>
-              <w:t>428.25</w:t>
+              <w:t>430.00</w:t>
             </w:r>
           </w:p>
         </w:tc>
@@ -14518,7 +14517,7 @@
               <w:rPr>
                 <w:b/>
               </w:rPr>
-              <w:t>431.50</w:t>
+              <w:t>433.25</w:t>
             </w:r>
           </w:p>
         </w:tc>
@@ -14666,7 +14665,7 @@
             </w:pPr>
             <w:r/>
             <w:r>
-              <w:t>431.50</w:t>
+              <w:t>433.25</w:t>
             </w:r>
           </w:p>
         </w:tc>
@@ -14694,7 +14693,7 @@
             </w:pPr>
             <w:r/>
             <w:r>
-              <w:t>434.50</w:t>
+              <w:t>436.25</w:t>
             </w:r>
           </w:p>
         </w:tc>
@@ -14722,7 +14721,7 @@
             </w:pPr>
             <w:r/>
             <w:r>
-              <w:t>427.50</w:t>
+              <w:t>429.25</w:t>
             </w:r>
           </w:p>
         </w:tc>
@@ -14753,7 +14752,7 @@
               <w:rPr>
                 <w:b/>
               </w:rPr>
-              <w:t>432.25</w:t>
+              <w:t>434.00</w:t>
             </w:r>
           </w:p>
         </w:tc>
@@ -14901,7 +14900,7 @@
             </w:pPr>
             <w:r/>
             <w:r>
-              <w:t>432.25</w:t>
+              <w:t>434.00</w:t>
             </w:r>
           </w:p>
         </w:tc>
@@ -14929,7 +14928,7 @@
             </w:pPr>
             <w:r/>
             <w:r>
-              <w:t>436.75</w:t>
+              <w:t>438.50</w:t>
             </w:r>
           </w:p>
         </w:tc>
@@ -14957,7 +14956,7 @@
             </w:pPr>
             <w:r/>
             <w:r>
-              <w:t>427.25</w:t>
+              <w:t>429.00</w:t>
             </w:r>
           </w:p>
         </w:tc>
@@ -14988,7 +14987,7 @@
               <w:rPr>
                 <w:b/>
               </w:rPr>
-              <w:t>433.00</w:t>
+              <w:t>434.75</w:t>
             </w:r>
           </w:p>
         </w:tc>
@@ -15136,7 +15135,7 @@
             </w:pPr>
             <w:r/>
             <w:r>
-              <w:t>433.00</w:t>
+              <w:t>434.75</w:t>
             </w:r>
           </w:p>
         </w:tc>
@@ -15164,7 +15163,7 @@
             </w:pPr>
             <w:r/>
             <w:r>
-              <w:t>438.50</w:t>
+              <w:t>440.25</w:t>
             </w:r>
           </w:p>
         </w:tc>
@@ -15192,7 +15191,7 @@
             </w:pPr>
             <w:r/>
             <w:r>
-              <w:t>426.75</w:t>
+              <w:t>428.50</w:t>
             </w:r>
           </w:p>
         </w:tc>
@@ -15223,7 +15222,7 @@
               <w:rPr>
                 <w:b/>
               </w:rPr>
-              <w:t>435.25</w:t>
+              <w:t>437.00</w:t>
             </w:r>
           </w:p>
         </w:tc>
@@ -15371,7 +15370,7 @@
             </w:pPr>
             <w:r/>
             <w:r>
-              <w:t>435.25</w:t>
+              <w:t>437.00</w:t>
             </w:r>
           </w:p>
         </w:tc>
@@ -15399,7 +15398,7 @@
             </w:pPr>
             <w:r/>
             <w:r>
-              <w:t>438.25</w:t>
+              <w:t>440.00</w:t>
             </w:r>
           </w:p>
         </w:tc>
@@ -15427,7 +15426,7 @@
             </w:pPr>
             <w:r/>
             <w:r>
-              <w:t>431.00</w:t>
+              <w:t>432.75</w:t>
             </w:r>
           </w:p>
         </w:tc>
@@ -15458,7 +15457,7 @@
               <w:rPr>
                 <w:b/>
               </w:rPr>
-              <w:t>435.50</w:t>
+              <w:t>437.25</w:t>
             </w:r>
           </w:p>
         </w:tc>
@@ -15606,7 +15605,7 @@
             </w:pPr>
             <w:r/>
             <w:r>
-              <w:t>435.50</w:t>
+              <w:t>437.25</w:t>
             </w:r>
           </w:p>
         </w:tc>
@@ -15634,7 +15633,7 @@
             </w:pPr>
             <w:r/>
             <w:r>
-              <w:t>438.75</w:t>
+              <w:t>440.50</w:t>
             </w:r>
           </w:p>
         </w:tc>
@@ -15662,7 +15661,7 @@
             </w:pPr>
             <w:r/>
             <w:r>
-              <w:t>429.00</w:t>
+              <w:t>430.75</w:t>
             </w:r>
           </w:p>
         </w:tc>
@@ -15693,7 +15692,7 @@
               <w:rPr>
                 <w:b/>
               </w:rPr>
-              <w:t>436.25</w:t>
+              <w:t>438.00</w:t>
             </w:r>
           </w:p>
         </w:tc>
@@ -15841,7 +15840,7 @@
             </w:pPr>
             <w:r/>
             <w:r>
-              <w:t>436.25</w:t>
+              <w:t>438.00</w:t>
             </w:r>
           </w:p>
         </w:tc>
@@ -15869,7 +15868,7 @@
             </w:pPr>
             <w:r/>
             <w:r>
-              <w:t>439.25</w:t>
+              <w:t>441.00</w:t>
             </w:r>
           </w:p>
         </w:tc>
@@ -15897,7 +15896,7 @@
             </w:pPr>
             <w:r/>
             <w:r>
-              <w:t>431.75</w:t>
+              <w:t>433.50</w:t>
             </w:r>
           </w:p>
         </w:tc>
@@ -15928,7 +15927,7 @@
               <w:rPr>
                 <w:b/>
               </w:rPr>
-              <w:t>435.75</w:t>
+              <w:t>437.50</w:t>
             </w:r>
           </w:p>
         </w:tc>
@@ -16076,7 +16075,7 @@
             </w:pPr>
             <w:r/>
             <w:r>
-              <w:t>435.75</w:t>
+              <w:t>437.50</w:t>
             </w:r>
           </w:p>
         </w:tc>
@@ -16104,7 +16103,7 @@
             </w:pPr>
             <w:r/>
             <w:r>
-              <w:t>439.75</w:t>
+              <w:t>441.50</w:t>
             </w:r>
           </w:p>
         </w:tc>
@@ -16132,7 +16131,7 @@
             </w:pPr>
             <w:r/>
             <w:r>
-              <w:t>430.00</w:t>
+              <w:t>431.75</w:t>
             </w:r>
           </w:p>
         </w:tc>
@@ -16163,7 +16162,7 @@
               <w:rPr>
                 <w:b/>
               </w:rPr>
-              <w:t>436.25</w:t>
+              <w:t>438.00</w:t>
             </w:r>
           </w:p>
         </w:tc>
@@ -16311,7 +16310,7 @@
             </w:pPr>
             <w:r/>
             <w:r>
-              <w:t>436.25</w:t>
+              <w:t>438.00</w:t>
             </w:r>
           </w:p>
         </w:tc>
@@ -16339,7 +16338,7 @@
             </w:pPr>
             <w:r/>
             <w:r>
-              <w:t>438.75</w:t>
+              <w:t>440.50</w:t>
             </w:r>
           </w:p>
         </w:tc>
@@ -16367,7 +16366,7 @@
             </w:pPr>
             <w:r/>
             <w:r>
-              <w:t>433.00</w:t>
+              <w:t>434.75</w:t>
             </w:r>
           </w:p>
         </w:tc>
@@ -16398,7 +16397,7 @@
               <w:rPr>
                 <w:b/>
               </w:rPr>
-              <w:t>436.75</w:t>
+              <w:t>438.50</w:t>
             </w:r>
           </w:p>
         </w:tc>
@@ -16546,7 +16545,7 @@
             </w:pPr>
             <w:r/>
             <w:r>
-              <w:t>436.75</w:t>
+              <w:t>438.50</w:t>
             </w:r>
           </w:p>
         </w:tc>
@@ -16574,7 +16573,7 @@
             </w:pPr>
             <w:r/>
             <w:r>
-              <w:t>440.25</w:t>
+              <w:t>442.00</w:t>
             </w:r>
           </w:p>
         </w:tc>
@@ -16602,7 +16601,7 @@
             </w:pPr>
             <w:r/>
             <w:r>
-              <w:t>430.75</w:t>
+              <w:t>432.50</w:t>
             </w:r>
           </w:p>
         </w:tc>
@@ -16633,7 +16632,7 @@
               <w:rPr>
                 <w:b/>
               </w:rPr>
-              <w:t>437.75</w:t>
+              <w:t>439.50</w:t>
             </w:r>
           </w:p>
         </w:tc>
@@ -16781,7 +16780,7 @@
             </w:pPr>
             <w:r/>
             <w:r>
-              <w:t>437.75</w:t>
+              <w:t>439.50</w:t>
             </w:r>
           </w:p>
         </w:tc>
@@ -16809,7 +16808,7 @@
             </w:pPr>
             <w:r/>
             <w:r>
-              <w:t>440.50</w:t>
+              <w:t>442.25</w:t>
             </w:r>
           </w:p>
         </w:tc>
@@ -16837,7 +16836,7 @@
             </w:pPr>
             <w:r/>
             <w:r>
-              <w:t>435.25</w:t>
+              <w:t>437.00</w:t>
             </w:r>
           </w:p>
         </w:tc>
@@ -16868,7 +16867,7 @@
               <w:rPr>
                 <w:b/>
               </w:rPr>
-              <w:t>437.75</w:t>
+              <w:t>439.50</w:t>
             </w:r>
           </w:p>
         </w:tc>
@@ -17016,7 +17015,7 @@
             </w:pPr>
             <w:r/>
             <w:r>
-              <w:t>437.75</w:t>
+              <w:t>439.50</w:t>
             </w:r>
           </w:p>
         </w:tc>
@@ -17044,7 +17043,7 @@
             </w:pPr>
             <w:r/>
             <w:r>
-              <w:t>440.50</w:t>
+              <w:t>442.25</w:t>
             </w:r>
           </w:p>
         </w:tc>
@@ -17072,7 +17071,7 @@
             </w:pPr>
             <w:r/>
             <w:r>
-              <w:t>435.25</w:t>
+              <w:t>437.00</w:t>
             </w:r>
           </w:p>
         </w:tc>
@@ -17103,7 +17102,7 @@
               <w:rPr>
                 <w:b/>
               </w:rPr>
-              <w:t>437.25</w:t>
+              <w:t>439.00</w:t>
             </w:r>
           </w:p>
         </w:tc>
@@ -17251,7 +17250,7 @@
             </w:pPr>
             <w:r/>
             <w:r>
-              <w:t>437.25</w:t>
+              <w:t>439.00</w:t>
             </w:r>
           </w:p>
         </w:tc>
@@ -17279,7 +17278,7 @@
             </w:pPr>
             <w:r/>
             <w:r>
-              <w:t>440.25</w:t>
+              <w:t>442.00</w:t>
             </w:r>
           </w:p>
         </w:tc>
@@ -17307,7 +17306,7 @@
             </w:pPr>
             <w:r/>
             <w:r>
-              <w:t>434.00</w:t>
+              <w:t>435.75</w:t>
             </w:r>
           </w:p>
         </w:tc>
@@ -17338,7 +17337,7 @@
               <w:rPr>
                 <w:b/>
               </w:rPr>
-              <w:t>437.00</w:t>
+              <w:t>438.75</w:t>
             </w:r>
           </w:p>
         </w:tc>
@@ -17486,7 +17485,7 @@
             </w:pPr>
             <w:r/>
             <w:r>
-              <w:t>437.00</w:t>
+              <w:t>438.75</w:t>
             </w:r>
           </w:p>
         </w:tc>
@@ -17514,7 +17513,7 @@
             </w:pPr>
             <w:r/>
             <w:r>
-              <w:t>441.00</w:t>
+              <w:t>442.75</w:t>
             </w:r>
           </w:p>
         </w:tc>
@@ -17542,7 +17541,7 @@
             </w:pPr>
             <w:r/>
             <w:r>
-              <w:t>431.75</w:t>
+              <w:t>433.50</w:t>
             </w:r>
           </w:p>
         </w:tc>
@@ -17573,7 +17572,7 @@
               <w:rPr>
                 <w:b/>
               </w:rPr>
-              <w:t>437.50</w:t>
+              <w:t>439.25</w:t>
             </w:r>
           </w:p>
         </w:tc>
@@ -17721,7 +17720,7 @@
             </w:pPr>
             <w:r/>
             <w:r>
-              <w:t>437.50</w:t>
+              <w:t>439.25</w:t>
             </w:r>
           </w:p>
         </w:tc>
@@ -17749,7 +17748,7 @@
             </w:pPr>
             <w:r/>
             <w:r>
-              <w:t>442.25</w:t>
+              <w:t>444.00</w:t>
             </w:r>
           </w:p>
         </w:tc>
@@ -17777,7 +17776,7 @@
             </w:pPr>
             <w:r/>
             <w:r>
-              <w:t>430.50</w:t>
+              <w:t>432.25</w:t>
             </w:r>
           </w:p>
         </w:tc>
@@ -17808,7 +17807,7 @@
               <w:rPr>
                 <w:b/>
               </w:rPr>
-              <w:t>439.50</w:t>
+              <w:t>441.25</w:t>
             </w:r>
           </w:p>
         </w:tc>
@@ -17956,7 +17955,7 @@
             </w:pPr>
             <w:r/>
             <w:r>
-              <w:t>439.50</w:t>
+              <w:t>441.25</w:t>
             </w:r>
           </w:p>
         </w:tc>
@@ -17984,7 +17983,7 @@
             </w:pPr>
             <w:r/>
             <w:r>
-              <w:t>447.50</w:t>
+              <w:t>449.25</w:t>
             </w:r>
           </w:p>
         </w:tc>
@@ -18012,7 +18011,7 @@
             </w:pPr>
             <w:r/>
             <w:r>
-              <w:t>432.50</w:t>
+              <w:t>434.25</w:t>
             </w:r>
           </w:p>
         </w:tc>
@@ -18043,7 +18042,7 @@
               <w:rPr>
                 <w:b/>
               </w:rPr>
-              <w:t>441.00</w:t>
+              <w:t>442.75</w:t>
             </w:r>
           </w:p>
         </w:tc>
@@ -18191,7 +18190,7 @@
             </w:pPr>
             <w:r/>
             <w:r>
-              <w:t>441.00</w:t>
+              <w:t>442.75</w:t>
             </w:r>
           </w:p>
         </w:tc>
@@ -18219,7 +18218,7 @@
             </w:pPr>
             <w:r/>
             <w:r>
-              <w:t>445.50</w:t>
+              <w:t>447.25</w:t>
             </w:r>
           </w:p>
         </w:tc>
@@ -18247,7 +18246,7 @@
             </w:pPr>
             <w:r/>
             <w:r>
-              <w:t>436.75</w:t>
+              <w:t>438.50</w:t>
             </w:r>
           </w:p>
         </w:tc>
@@ -18278,7 +18277,7 @@
               <w:rPr>
                 <w:b/>
               </w:rPr>
-              <w:t>440.50</w:t>
+              <w:t>442.25</w:t>
             </w:r>
           </w:p>
         </w:tc>
@@ -18426,7 +18425,7 @@
             </w:pPr>
             <w:r/>
             <w:r>
-              <w:t>440.50</w:t>
+              <w:t>442.25</w:t>
             </w:r>
           </w:p>
         </w:tc>
@@ -18454,7 +18453,7 @@
             </w:pPr>
             <w:r/>
             <w:r>
-              <w:t>442.75</w:t>
+              <w:t>444.50</w:t>
             </w:r>
           </w:p>
         </w:tc>
@@ -18482,7 +18481,7 @@
             </w:pPr>
             <w:r/>
             <w:r>
-              <w:t>437.75</w:t>
+              <w:t>439.50</w:t>
             </w:r>
           </w:p>
         </w:tc>
@@ -18513,7 +18512,7 @@
               <w:rPr>
                 <w:b/>
               </w:rPr>
-              <w:t>440.25</w:t>
+              <w:t>442.00</w:t>
             </w:r>
           </w:p>
         </w:tc>
@@ -18661,7 +18660,7 @@
             </w:pPr>
             <w:r/>
             <w:r>
-              <w:t>440.25</w:t>
+              <w:t>442.00</w:t>
             </w:r>
           </w:p>
         </w:tc>
@@ -18689,7 +18688,7 @@
             </w:pPr>
             <w:r/>
             <w:r>
-              <w:t>442.25</w:t>
+              <w:t>444.00</w:t>
             </w:r>
           </w:p>
         </w:tc>
@@ -18717,7 +18716,7 @@
             </w:pPr>
             <w:r/>
             <w:r>
-              <w:t>435.75</w:t>
+              <w:t>437.50</w:t>
             </w:r>
           </w:p>
         </w:tc>
@@ -18748,7 +18747,7 @@
               <w:rPr>
                 <w:b/>
               </w:rPr>
-              <w:t>440.50</w:t>
+              <w:t>442.25</w:t>
             </w:r>
           </w:p>
         </w:tc>
@@ -18896,7 +18895,7 @@
             </w:pPr>
             <w:r/>
             <w:r>
-              <w:t>440.50</w:t>
+              <w:t>442.25</w:t>
             </w:r>
           </w:p>
         </w:tc>
@@ -18924,7 +18923,7 @@
             </w:pPr>
             <w:r/>
             <w:r>
-              <w:t>444.25</w:t>
+              <w:t>446.00</w:t>
             </w:r>
           </w:p>
         </w:tc>
@@ -18952,7 +18951,7 @@
             </w:pPr>
             <w:r/>
             <w:r>
-              <w:t>437.75</w:t>
+              <w:t>439.50</w:t>
             </w:r>
           </w:p>
         </w:tc>
@@ -18983,7 +18982,7 @@
               <w:rPr>
                 <w:b/>
               </w:rPr>
-              <w:t>441.00</w:t>
+              <w:t>442.75</w:t>
             </w:r>
           </w:p>
         </w:tc>
@@ -19131,7 +19130,7 @@
             </w:pPr>
             <w:r/>
             <w:r>
-              <w:t>441.00</w:t>
+              <w:t>442.75</w:t>
             </w:r>
           </w:p>
         </w:tc>
@@ -19159,7 +19158,7 @@
             </w:pPr>
             <w:r/>
             <w:r>
-              <w:t>444.00</w:t>
+              <w:t>445.75</w:t>
             </w:r>
           </w:p>
         </w:tc>
@@ -19187,7 +19186,7 @@
             </w:pPr>
             <w:r/>
             <w:r>
-              <w:t>436.50</w:t>
+              <w:t>438.25</w:t>
             </w:r>
           </w:p>
         </w:tc>
@@ -19218,7 +19217,7 @@
               <w:rPr>
                 <w:b/>
               </w:rPr>
-              <w:t>441.25</w:t>
+              <w:t>443.00</w:t>
             </w:r>
           </w:p>
         </w:tc>
@@ -19366,7 +19365,7 @@
             </w:pPr>
             <w:r/>
             <w:r>
-              <w:t>441.25</w:t>
+              <w:t>443.00</w:t>
             </w:r>
           </w:p>
         </w:tc>
@@ -19394,7 +19393,7 @@
             </w:pPr>
             <w:r/>
             <w:r>
-              <w:t>445.50</w:t>
+              <w:t>447.25</w:t>
             </w:r>
           </w:p>
         </w:tc>
@@ -19422,7 +19421,7 @@
             </w:pPr>
             <w:r/>
             <w:r>
-              <w:t>438.00</w:t>
+              <w:t>439.75</w:t>
             </w:r>
           </w:p>
         </w:tc>
@@ -19453,7 +19452,7 @@
               <w:rPr>
                 <w:b/>
               </w:rPr>
-              <w:t>442.00</w:t>
+              <w:t>443.75</w:t>
             </w:r>
           </w:p>
         </w:tc>
@@ -19601,7 +19600,7 @@
             </w:pPr>
             <w:r/>
             <w:r>
-              <w:t>442.00</w:t>
+              <w:t>443.75</w:t>
             </w:r>
           </w:p>
         </w:tc>
@@ -19629,7 +19628,7 @@
             </w:pPr>
             <w:r/>
             <w:r>
-              <w:t>445.50</w:t>
+              <w:t>447.25</w:t>
             </w:r>
           </w:p>
         </w:tc>
@@ -19657,7 +19656,7 @@
             </w:pPr>
             <w:r/>
             <w:r>
-              <w:t>439.75</w:t>
+              <w:t>441.50</w:t>
             </w:r>
           </w:p>
         </w:tc>
@@ -19688,7 +19687,7 @@
               <w:rPr>
                 <w:b/>
               </w:rPr>
-              <w:t>442.00</w:t>
+              <w:t>443.75</w:t>
             </w:r>
           </w:p>
         </w:tc>
@@ -19836,7 +19835,7 @@
             </w:pPr>
             <w:r/>
             <w:r>
-              <w:t>442.00</w:t>
+              <w:t>443.75</w:t>
             </w:r>
           </w:p>
         </w:tc>
@@ -19864,7 +19863,7 @@
             </w:pPr>
             <w:r/>
             <w:r>
-              <w:t>445.75</w:t>
+              <w:t>447.50</w:t>
             </w:r>
           </w:p>
         </w:tc>
@@ -19892,7 +19891,7 @@
             </w:pPr>
             <w:r/>
             <w:r>
-              <w:t>438.50</w:t>
+              <w:t>440.25</w:t>
             </w:r>
           </w:p>
         </w:tc>
@@ -19923,7 +19922,7 @@
               <w:rPr>
                 <w:b/>
               </w:rPr>
-              <w:t>441.75</w:t>
+              <w:t>443.50</w:t>
             </w:r>
           </w:p>
         </w:tc>
@@ -20071,7 +20070,7 @@
             </w:pPr>
             <w:r/>
             <w:r>
-              <w:t>441.75</w:t>
+              <w:t>443.50</w:t>
             </w:r>
           </w:p>
         </w:tc>
@@ -20099,7 +20098,7 @@
             </w:pPr>
             <w:r/>
             <w:r>
-              <w:t>445.25</w:t>
+              <w:t>447.00</w:t>
             </w:r>
           </w:p>
         </w:tc>
@@ -20127,7 +20126,7 @@
             </w:pPr>
             <w:r/>
             <w:r>
-              <w:t>438.50</w:t>
+              <w:t>440.25</w:t>
             </w:r>
           </w:p>
         </w:tc>
@@ -20158,7 +20157,7 @@
               <w:rPr>
                 <w:b/>
               </w:rPr>
-              <w:t>441.50</w:t>
+              <w:t>443.25</w:t>
             </w:r>
           </w:p>
         </w:tc>
@@ -20306,7 +20305,7 @@
             </w:pPr>
             <w:r/>
             <w:r>
-              <w:t>441.50</w:t>
+              <w:t>443.25</w:t>
             </w:r>
           </w:p>
         </w:tc>
@@ -20334,7 +20333,7 @@
             </w:pPr>
             <w:r/>
             <w:r>
-              <w:t>444.50</w:t>
+              <w:t>446.25</w:t>
             </w:r>
           </w:p>
         </w:tc>
@@ -20362,7 +20361,7 @@
             </w:pPr>
             <w:r/>
             <w:r>
-              <w:t>438.75</w:t>
+              <w:t>440.50</w:t>
             </w:r>
           </w:p>
         </w:tc>
@@ -20393,7 +20392,7 @@
               <w:rPr>
                 <w:b/>
               </w:rPr>
-              <w:t>441.75</w:t>
+              <w:t>443.50</w:t>
             </w:r>
           </w:p>
         </w:tc>
@@ -20541,7 +20540,7 @@
             </w:pPr>
             <w:r/>
             <w:r>
-              <w:t>441.75</w:t>
+              <w:t>443.50</w:t>
             </w:r>
           </w:p>
         </w:tc>
@@ -20569,7 +20568,7 @@
             </w:pPr>
             <w:r/>
             <w:r>
-              <w:t>444.75</w:t>
+              <w:t>446.50</w:t>
             </w:r>
           </w:p>
         </w:tc>
@@ -20597,7 +20596,7 @@
             </w:pPr>
             <w:r/>
             <w:r>
-              <w:t>439.00</w:t>
+              <w:t>440.75</w:t>
             </w:r>
           </w:p>
         </w:tc>
@@ -20628,7 +20627,7 @@
               <w:rPr>
                 <w:b/>
               </w:rPr>
-              <w:t>441.75</w:t>
+              <w:t>443.50</w:t>
             </w:r>
           </w:p>
         </w:tc>
@@ -20776,7 +20775,7 @@
             </w:pPr>
             <w:r/>
             <w:r>
-              <w:t>441.75</w:t>
+              <w:t>443.50</w:t>
             </w:r>
           </w:p>
         </w:tc>
@@ -20804,7 +20803,7 @@
             </w:pPr>
             <w:r/>
             <w:r>
-              <w:t>445.75</w:t>
+              <w:t>447.50</w:t>
             </w:r>
           </w:p>
         </w:tc>
@@ -20832,7 +20831,7 @@
             </w:pPr>
             <w:r/>
             <w:r>
-              <w:t>438.25</w:t>
+              <w:t>440.00</w:t>
             </w:r>
           </w:p>
         </w:tc>
@@ -20863,7 +20862,7 @@
               <w:rPr>
                 <w:b/>
               </w:rPr>
-              <w:t>442.25</w:t>
+              <w:t>444.00</w:t>
             </w:r>
           </w:p>
         </w:tc>
@@ -21011,7 +21010,7 @@
             </w:pPr>
             <w:r/>
             <w:r>
-              <w:t>442.25</w:t>
+              <w:t>444.00</w:t>
             </w:r>
           </w:p>
         </w:tc>
@@ -21039,7 +21038,7 @@
             </w:pPr>
             <w:r/>
             <w:r>
-              <w:t>446.25</w:t>
+              <w:t>448.00</w:t>
             </w:r>
           </w:p>
         </w:tc>
@@ -21067,7 +21066,7 @@
             </w:pPr>
             <w:r/>
             <w:r>
-              <w:t>440.50</w:t>
+              <w:t>442.25</w:t>
             </w:r>
           </w:p>
         </w:tc>
@@ -21098,7 +21097,7 @@
               <w:rPr>
                 <w:b/>
               </w:rPr>
-              <w:t>442.00</w:t>
+              <w:t>443.75</w:t>
             </w:r>
           </w:p>
         </w:tc>
@@ -21742,7 +21741,7 @@
               <w:rPr>
                 <w:b/>
               </w:rPr>
-              <w:t>Tăng (Bullish)</w:t>
+              <w:t>Giảm (Bearish)</w:t>
             </w:r>
           </w:p>
         </w:tc>
@@ -21770,7 +21769,7 @@
             </w:pPr>
             <w:r/>
             <w:r>
-              <w:t>EMA_21 H1 &gt; EMA_50 H1 (Hội tụ động lượng tăng)</w:t>
+              <w:t>EMA_21 H1 &lt; EMA_50 H1 (Áp lực bán duy trì)</w:t>
             </w:r>
           </w:p>
         </w:tc>
@@ -21821,7 +21820,7 @@
         <w:t>Giá Chốt Phiên (Close):</w:t>
       </w:r>
       <w:r>
-        <w:t xml:space="preserve"> 606.00 cents | </w:t>
+        <w:t xml:space="preserve"> 619.00 cents | </w:t>
       </w:r>
       <w:r>
         <w:rPr>
@@ -21836,10 +21835,10 @@
         <w:rPr>
           <w:b/>
         </w:rPr>
-        <w:t>`609.15 cents`</w:t>
+        <w:t>`619.72 cents`</w:t>
       </w:r>
       <w:r>
-        <w:t xml:space="preserve"> (+3.15).</w:t>
+        <w:t xml:space="preserve"> (+0.72).</w:t>
       </w:r>
     </w:p>
     <w:p>
@@ -21860,7 +21859,7 @@
         <w:rPr>
           <w:b/>
         </w:rPr>
-        <w:t>`1,636`</w:t>
+        <w:t>`43,590`</w:t>
       </w:r>
       <w:r>
         <w:t xml:space="preserve"> (Chênh lệch: </w:t>
@@ -21869,7 +21868,7 @@
         <w:rPr>
           <w:b/>
         </w:rPr>
-        <w:t>`-70,314`</w:t>
+        <w:t>`-28,360`</w:t>
       </w:r>
       <w:r>
         <w:t xml:space="preserve">) | OI: </w:t>
@@ -21878,7 +21877,7 @@
         <w:rPr>
           <w:b/>
         </w:rPr>
-        <w:t>`215,548`</w:t>
+        <w:t>`215,571`</w:t>
       </w:r>
       <w:r>
         <w:t xml:space="preserve"> (Chênh lệch: </w:t>
@@ -21887,7 +21886,7 @@
         <w:rPr>
           <w:b/>
         </w:rPr>
-        <w:t>`+426`</w:t>
+        <w:t>`+23`</w:t>
       </w:r>
       <w:r>
         <w:t>)</w:t>
@@ -21911,7 +21910,7 @@
         <w:rPr>
           <w:b/>
         </w:rPr>
-        <w:t>`Doji (Nến lưỡng lự thế trận)`</w:t>
+        <w:t>`Không phát hiện mô hình nến đặc biệt`</w:t>
       </w:r>
     </w:p>
     <w:p>
@@ -21932,7 +21931,7 @@
         <w:rPr>
           <w:b/>
         </w:rPr>
-        <w:t>`Giảm nhẹ tích lũy (Distribution Decline)`</w:t>
+        <w:t>`Tăng nhẹ tích lũy (Accumulation Rally)`</w:t>
       </w:r>
     </w:p>
     <w:p>
@@ -21953,10 +21952,10 @@
         <w:rPr>
           <w:b/>
         </w:rPr>
-        <w:t>TÍCH LŨY TIÊU CỰC (Distribution):</w:t>
+        <w:t>TÍCH LŨY TÍCH CỰC (Accumulation):</w:t>
       </w:r>
       <w:r>
-        <w:t xml:space="preserve"> Nến đi ngang nhưng dòng tiền rút dần (OI giảm), cảnh báo rủi ro suy sụt sắp tới.</w:t>
+        <w:t xml:space="preserve"> Nến đi ngang nhưng dòng tiền âm thầm gia tăng (OI tăng), báo hiệu chuẩn bị có nhịp bứt phá tăng.</w:t>
       </w:r>
     </w:p>
     <w:p>
@@ -22970,7 +22969,7 @@
         <w:t xml:space="preserve"> EMA_21 </w:t>
       </w:r>
       <w:r>
-        <w:t xml:space="preserve"> (612.95) &gt; </w:t>
+        <w:t xml:space="preserve"> (610.12) &lt; </w:t>
       </w:r>
       <w:r>
         <w:rPr>
@@ -22981,7 +22980,7 @@
         <w:t xml:space="preserve"> EMA_50 </w:t>
       </w:r>
       <w:r>
-        <w:t xml:space="preserve"> (612.30).</w:t>
+        <w:t xml:space="preserve"> (610.60).</w:t>
       </w:r>
     </w:p>
     <w:p>
@@ -23002,7 +23001,7 @@
         <w:rPr>
           <w:b/>
         </w:rPr>
-        <w:t>`31.16`</w:t>
+        <w:t>`68.70`</w:t>
       </w:r>
       <w:r>
         <w:t xml:space="preserve"> | ATR (14) = </w:t>
@@ -23011,7 +23010,7 @@
         <w:rPr>
           <w:b/>
         </w:rPr>
-        <w:t>`3.16`</w:t>
+        <w:t>`4.07`</w:t>
       </w:r>
       <w:r>
         <w:t xml:space="preserve"> cents | Volatility = </w:t>
@@ -23020,7 +23019,7 @@
         <w:rPr>
           <w:b/>
         </w:rPr>
-        <w:t>`0.00 cents`</w:t>
+        <w:t>`1.50 cents`</w:t>
       </w:r>
       <w:r>
         <w:t>.</w:t>
@@ -23044,7 +23043,7 @@
         <w:rPr>
           <w:b/>
         </w:rPr>
-        <w:t>`602.75`</w:t>
+        <w:t>`614.50`</w:t>
       </w:r>
       <w:r>
         <w:t xml:space="preserve"> | S2: </w:t>
@@ -23062,7 +23061,7 @@
         <w:rPr>
           <w:b/>
         </w:rPr>
-        <w:t>`607.75`</w:t>
+        <w:t>`624.00`</w:t>
       </w:r>
       <w:r>
         <w:t xml:space="preserve"> | R2: </w:t>
@@ -23795,7 +23794,7 @@
           <w:b/>
           <w:color w:val="B91C1C"/>
         </w:rPr>
-        <w:t>`612.95 - 612.30 cents (Canh bán hồi kỹ thuật H1)`</w:t>
+        <w:t>`610.12 - 610.60 cents (Canh bán hồi kỹ thuật H1)`</w:t>
       </w:r>
       <w:r>
         <w:t xml:space="preserve"> | SL: </w:t>
@@ -23804,7 +23803,7 @@
         <w:rPr>
           <w:b/>
         </w:rPr>
-        <w:t>`631.75 cents (Trên kháng cự R2 + 1.5x ATR)`</w:t>
+        <w:t>`633.10 cents (Trên kháng cự R2 + 1.5x ATR)`</w:t>
       </w:r>
       <w:r>
         <w:t xml:space="preserve"> | TP: </w:t>
@@ -23815,7 +23814,7 @@
           <w:color w:val="D97706"/>
           <w:sz w:val="19"/>
         </w:rPr>
-        <w:t xml:space="preserve"> 602.75 cents </w:t>
+        <w:t xml:space="preserve"> 614.50 cents </w:t>
       </w:r>
       <w:r>
         <w:t xml:space="preserve"> / </w:t>
@@ -23866,7 +23865,7 @@
         <w:rPr>
           <w:b/>
         </w:rPr>
-        <w:t>`600.75 - 602.75 cents`</w:t>
+        <w:t>`612.50 - 614.50 cents`</w:t>
       </w:r>
       <w:r>
         <w:t xml:space="preserve"> | SL: </w:t>
@@ -23875,7 +23874,7 @@
         <w:rPr>
           <w:b/>
         </w:rPr>
-        <w:t>`570.84 cents`</w:t>
+        <w:t>`569.93 cents`</w:t>
       </w:r>
       <w:r>
         <w:t xml:space="preserve"> | TP: </w:t>
@@ -23884,7 +23883,7 @@
         <w:rPr>
           <w:b/>
         </w:rPr>
-        <w:t>`607.75 cents (Đón sóng hồi trung hạn ~14.5 giá)`</w:t>
+        <w:t>`624.00 cents (Đón sóng hồi trung hạn ~14.5 giá)`</w:t>
       </w:r>
       <w:r>
         <w:t>.</w:t>
@@ -23912,7 +23911,7 @@
         <w:rPr>
           <w:b/>
         </w:rPr>
-        <w:t>`607.75 - 609.75 cents`</w:t>
+        <w:t>`624.00 - 626.00 cents`</w:t>
       </w:r>
       <w:r>
         <w:t xml:space="preserve"> | SL: </w:t>
@@ -23921,7 +23920,7 @@
         <w:rPr>
           <w:b/>
         </w:rPr>
-        <w:t>`610.91 cents`</w:t>
+        <w:t>`628.07 cents`</w:t>
       </w:r>
       <w:r>
         <w:t xml:space="preserve"> | TP: </w:t>
@@ -23970,7 +23969,7 @@
         <w:rPr>
           <w:b/>
         </w:rPr>
-        <w:t>`578.55 - 590.50 cents`</w:t>
+        <w:t>`575.28 - 590.50 cents`</w:t>
       </w:r>
     </w:p>
     <w:p>
@@ -24377,7 +24376,7 @@
             </w:pPr>
             <w:r/>
             <w:r>
-              <w:t>606.00</w:t>
+              <w:t>619.00</w:t>
             </w:r>
           </w:p>
         </w:tc>
@@ -24405,7 +24404,7 @@
             </w:pPr>
             <w:r/>
             <w:r>
-              <w:t>617.25</w:t>
+              <w:t>630.25</w:t>
             </w:r>
           </w:p>
         </w:tc>
@@ -24433,7 +24432,7 @@
             </w:pPr>
             <w:r/>
             <w:r>
-              <w:t>600.50</w:t>
+              <w:t>613.50</w:t>
             </w:r>
           </w:p>
         </w:tc>
@@ -24464,7 +24463,7 @@
               <w:rPr>
                 <w:b/>
               </w:rPr>
-              <w:t>605.25</w:t>
+              <w:t>618.25</w:t>
             </w:r>
           </w:p>
         </w:tc>
@@ -24612,7 +24611,7 @@
             </w:pPr>
             <w:r/>
             <w:r>
-              <w:t>605.25</w:t>
+              <w:t>618.25</w:t>
             </w:r>
           </w:p>
         </w:tc>
@@ -24640,7 +24639,7 @@
             </w:pPr>
             <w:r/>
             <w:r>
-              <w:t>612.75</w:t>
+              <w:t>625.75</w:t>
             </w:r>
           </w:p>
         </w:tc>
@@ -24668,7 +24667,7 @@
             </w:pPr>
             <w:r/>
             <w:r>
-              <w:t>599.25</w:t>
+              <w:t>612.25</w:t>
             </w:r>
           </w:p>
         </w:tc>
@@ -24699,7 +24698,7 @@
               <w:rPr>
                 <w:b/>
               </w:rPr>
-              <w:t>604.75</w:t>
+              <w:t>617.75</w:t>
             </w:r>
           </w:p>
         </w:tc>
@@ -24847,7 +24846,7 @@
             </w:pPr>
             <w:r/>
             <w:r>
-              <w:t>604.75</w:t>
+              <w:t>617.75</w:t>
             </w:r>
           </w:p>
         </w:tc>
@@ -24875,7 +24874,7 @@
             </w:pPr>
             <w:r/>
             <w:r>
-              <w:t>618.50</w:t>
+              <w:t>631.50</w:t>
             </w:r>
           </w:p>
         </w:tc>
@@ -24903,7 +24902,7 @@
             </w:pPr>
             <w:r/>
             <w:r>
-              <w:t>590.00</w:t>
+              <w:t>603.00</w:t>
             </w:r>
           </w:p>
         </w:tc>
@@ -24934,7 +24933,7 @@
               <w:rPr>
                 <w:b/>
               </w:rPr>
-              <w:t>606.75</w:t>
+              <w:t>619.75</w:t>
             </w:r>
           </w:p>
         </w:tc>
@@ -25082,7 +25081,7 @@
             </w:pPr>
             <w:r/>
             <w:r>
-              <w:t>606.75</w:t>
+              <w:t>619.75</w:t>
             </w:r>
           </w:p>
         </w:tc>
@@ -25110,7 +25109,7 @@
             </w:pPr>
             <w:r/>
             <w:r>
-              <w:t>620.00</w:t>
+              <w:t>633.00</w:t>
             </w:r>
           </w:p>
         </w:tc>
@@ -25138,7 +25137,7 @@
             </w:pPr>
             <w:r/>
             <w:r>
-              <w:t>598.50</w:t>
+              <w:t>611.50</w:t>
             </w:r>
           </w:p>
         </w:tc>
@@ -25169,7 +25168,7 @@
               <w:rPr>
                 <w:b/>
               </w:rPr>
-              <w:t>608.00</w:t>
+              <w:t>621.00</w:t>
             </w:r>
           </w:p>
         </w:tc>
@@ -25317,7 +25316,7 @@
             </w:pPr>
             <w:r/>
             <w:r>
-              <w:t>608.00</w:t>
+              <w:t>621.00</w:t>
             </w:r>
           </w:p>
         </w:tc>
@@ -25345,7 +25344,7 @@
             </w:pPr>
             <w:r/>
             <w:r>
-              <w:t>624.50</w:t>
+              <w:t>637.50</w:t>
             </w:r>
           </w:p>
         </w:tc>
@@ -25373,7 +25372,7 @@
             </w:pPr>
             <w:r/>
             <w:r>
-              <w:t>597.50</w:t>
+              <w:t>610.50</w:t>
             </w:r>
           </w:p>
         </w:tc>
@@ -25404,7 +25403,7 @@
               <w:rPr>
                 <w:b/>
               </w:rPr>
-              <w:t>612.50</w:t>
+              <w:t>625.50</w:t>
             </w:r>
           </w:p>
         </w:tc>
@@ -25552,7 +25551,7 @@
             </w:pPr>
             <w:r/>
             <w:r>
-              <w:t>612.50</w:t>
+              <w:t>625.50</w:t>
             </w:r>
           </w:p>
         </w:tc>
@@ -25580,7 +25579,7 @@
             </w:pPr>
             <w:r/>
             <w:r>
-              <w:t>620.25</w:t>
+              <w:t>633.25</w:t>
             </w:r>
           </w:p>
         </w:tc>
@@ -25608,7 +25607,7 @@
             </w:pPr>
             <w:r/>
             <w:r>
-              <w:t>601.50</w:t>
+              <w:t>614.50</w:t>
             </w:r>
           </w:p>
         </w:tc>
@@ -25639,7 +25638,7 @@
               <w:rPr>
                 <w:b/>
               </w:rPr>
-              <w:t>613.75</w:t>
+              <w:t>626.75</w:t>
             </w:r>
           </w:p>
         </w:tc>
@@ -25787,7 +25786,7 @@
             </w:pPr>
             <w:r/>
             <w:r>
-              <w:t>613.75</w:t>
+              <w:t>626.75</w:t>
             </w:r>
           </w:p>
         </w:tc>
@@ -25815,7 +25814,7 @@
             </w:pPr>
             <w:r/>
             <w:r>
-              <w:t>622.00</w:t>
+              <w:t>635.00</w:t>
             </w:r>
           </w:p>
         </w:tc>
@@ -25843,7 +25842,7 @@
             </w:pPr>
             <w:r/>
             <w:r>
-              <w:t>603.25</w:t>
+              <w:t>616.25</w:t>
             </w:r>
           </w:p>
         </w:tc>
@@ -25874,7 +25873,7 @@
               <w:rPr>
                 <w:b/>
               </w:rPr>
-              <w:t>615.50</w:t>
+              <w:t>628.50</w:t>
             </w:r>
           </w:p>
         </w:tc>
@@ -26022,7 +26021,7 @@
             </w:pPr>
             <w:r/>
             <w:r>
-              <w:t>615.50</w:t>
+              <w:t>628.50</w:t>
             </w:r>
           </w:p>
         </w:tc>
@@ -26050,7 +26049,7 @@
             </w:pPr>
             <w:r/>
             <w:r>
-              <w:t>627.75</w:t>
+              <w:t>640.75</w:t>
             </w:r>
           </w:p>
         </w:tc>
@@ -26078,7 +26077,7 @@
             </w:pPr>
             <w:r/>
             <w:r>
-              <w:t>605.75</w:t>
+              <w:t>618.75</w:t>
             </w:r>
           </w:p>
         </w:tc>
@@ -26109,7 +26108,7 @@
               <w:rPr>
                 <w:b/>
               </w:rPr>
-              <w:t>614.50</w:t>
+              <w:t>627.50</w:t>
             </w:r>
           </w:p>
         </w:tc>
@@ -26257,7 +26256,7 @@
             </w:pPr>
             <w:r/>
             <w:r>
-              <w:t>614.50</w:t>
+              <w:t>627.50</w:t>
             </w:r>
           </w:p>
         </w:tc>
@@ -26285,7 +26284,7 @@
             </w:pPr>
             <w:r/>
             <w:r>
-              <w:t>625.00</w:t>
+              <w:t>638.00</w:t>
             </w:r>
           </w:p>
         </w:tc>
@@ -26313,7 +26312,7 @@
             </w:pPr>
             <w:r/>
             <w:r>
-              <w:t>599.75</w:t>
+              <w:t>612.75</w:t>
             </w:r>
           </w:p>
         </w:tc>
@@ -26344,7 +26343,7 @@
               <w:rPr>
                 <w:b/>
               </w:rPr>
-              <w:t>616.75</w:t>
+              <w:t>629.75</w:t>
             </w:r>
           </w:p>
         </w:tc>
@@ -26492,7 +26491,7 @@
             </w:pPr>
             <w:r/>
             <w:r>
-              <w:t>616.75</w:t>
+              <w:t>629.75</w:t>
             </w:r>
           </w:p>
         </w:tc>
@@ -26520,7 +26519,7 @@
             </w:pPr>
             <w:r/>
             <w:r>
-              <w:t>627.25</w:t>
+              <w:t>640.25</w:t>
             </w:r>
           </w:p>
         </w:tc>
@@ -26548,7 +26547,7 @@
             </w:pPr>
             <w:r/>
             <w:r>
-              <w:t>610.50</w:t>
+              <w:t>623.50</w:t>
             </w:r>
           </w:p>
         </w:tc>
@@ -26579,7 +26578,7 @@
               <w:rPr>
                 <w:b/>
               </w:rPr>
-              <w:t>617.50</w:t>
+              <w:t>630.50</w:t>
             </w:r>
           </w:p>
         </w:tc>
@@ -26727,7 +26726,7 @@
             </w:pPr>
             <w:r/>
             <w:r>
-              <w:t>617.50</w:t>
+              <w:t>630.50</w:t>
             </w:r>
           </w:p>
         </w:tc>
@@ -26755,7 +26754,7 @@
             </w:pPr>
             <w:r/>
             <w:r>
-              <w:t>631.75</w:t>
+              <w:t>644.75</w:t>
             </w:r>
           </w:p>
         </w:tc>
@@ -26783,7 +26782,7 @@
             </w:pPr>
             <w:r/>
             <w:r>
-              <w:t>602.75</w:t>
+              <w:t>615.75</w:t>
             </w:r>
           </w:p>
         </w:tc>
@@ -26814,7 +26813,7 @@
               <w:rPr>
                 <w:b/>
               </w:rPr>
-              <w:t>619.50</w:t>
+              <w:t>632.50</w:t>
             </w:r>
           </w:p>
         </w:tc>
@@ -26962,7 +26961,7 @@
             </w:pPr>
             <w:r/>
             <w:r>
-              <w:t>619.50</w:t>
+              <w:t>632.50</w:t>
             </w:r>
           </w:p>
         </w:tc>
@@ -26990,7 +26989,7 @@
             </w:pPr>
             <w:r/>
             <w:r>
-              <w:t>626.00</w:t>
+              <w:t>639.00</w:t>
             </w:r>
           </w:p>
         </w:tc>
@@ -27018,7 +27017,7 @@
             </w:pPr>
             <w:r/>
             <w:r>
-              <w:t>612.75</w:t>
+              <w:t>625.75</w:t>
             </w:r>
           </w:p>
         </w:tc>
@@ -27049,7 +27048,7 @@
               <w:rPr>
                 <w:b/>
               </w:rPr>
-              <w:t>619.75</w:t>
+              <w:t>632.75</w:t>
             </w:r>
           </w:p>
         </w:tc>
@@ -27197,7 +27196,7 @@
             </w:pPr>
             <w:r/>
             <w:r>
-              <w:t>619.75</w:t>
+              <w:t>632.75</w:t>
             </w:r>
           </w:p>
         </w:tc>
@@ -27225,7 +27224,7 @@
             </w:pPr>
             <w:r/>
             <w:r>
-              <w:t>630.00</w:t>
+              <w:t>643.00</w:t>
             </w:r>
           </w:p>
         </w:tc>
@@ -27253,7 +27252,7 @@
             </w:pPr>
             <w:r/>
             <w:r>
-              <w:t>611.75</w:t>
+              <w:t>624.75</w:t>
             </w:r>
           </w:p>
         </w:tc>
@@ -27284,7 +27283,7 @@
               <w:rPr>
                 <w:b/>
               </w:rPr>
-              <w:t>620.25</w:t>
+              <w:t>633.25</w:t>
             </w:r>
           </w:p>
         </w:tc>
@@ -27432,7 +27431,7 @@
             </w:pPr>
             <w:r/>
             <w:r>
-              <w:t>620.25</w:t>
+              <w:t>633.25</w:t>
             </w:r>
           </w:p>
         </w:tc>
@@ -27460,7 +27459,7 @@
             </w:pPr>
             <w:r/>
             <w:r>
-              <w:t>627.25</w:t>
+              <w:t>640.25</w:t>
             </w:r>
           </w:p>
         </w:tc>
@@ -27488,7 +27487,7 @@
             </w:pPr>
             <w:r/>
             <w:r>
-              <w:t>614.25</w:t>
+              <w:t>627.25</w:t>
             </w:r>
           </w:p>
         </w:tc>
@@ -27519,7 +27518,7 @@
               <w:rPr>
                 <w:b/>
               </w:rPr>
-              <w:t>619.50</w:t>
+              <w:t>632.50</w:t>
             </w:r>
           </w:p>
         </w:tc>
@@ -27667,7 +27666,7 @@
             </w:pPr>
             <w:r/>
             <w:r>
-              <w:t>619.50</w:t>
+              <w:t>632.50</w:t>
             </w:r>
           </w:p>
         </w:tc>
@@ -27695,7 +27694,7 @@
             </w:pPr>
             <w:r/>
             <w:r>
-              <w:t>633.00</w:t>
+              <w:t>646.00</w:t>
             </w:r>
           </w:p>
         </w:tc>
@@ -27723,7 +27722,7 @@
             </w:pPr>
             <w:r/>
             <w:r>
-              <w:t>606.50</w:t>
+              <w:t>619.50</w:t>
             </w:r>
           </w:p>
         </w:tc>
@@ -27754,7 +27753,7 @@
               <w:rPr>
                 <w:b/>
               </w:rPr>
-              <w:t>621.25</w:t>
+              <w:t>634.25</w:t>
             </w:r>
           </w:p>
         </w:tc>
@@ -27902,7 +27901,7 @@
             </w:pPr>
             <w:r/>
             <w:r>
-              <w:t>621.25</w:t>
+              <w:t>634.25</w:t>
             </w:r>
           </w:p>
         </w:tc>
@@ -27930,7 +27929,7 @@
             </w:pPr>
             <w:r/>
             <w:r>
-              <w:t>630.50</w:t>
+              <w:t>643.50</w:t>
             </w:r>
           </w:p>
         </w:tc>
@@ -27958,7 +27957,7 @@
             </w:pPr>
             <w:r/>
             <w:r>
-              <w:t>610.50</w:t>
+              <w:t>623.50</w:t>
             </w:r>
           </w:p>
         </w:tc>
@@ -27989,7 +27988,7 @@
               <w:rPr>
                 <w:b/>
               </w:rPr>
-              <w:t>621.75</w:t>
+              <w:t>634.75</w:t>
             </w:r>
           </w:p>
         </w:tc>
@@ -28137,7 +28136,7 @@
             </w:pPr>
             <w:r/>
             <w:r>
-              <w:t>621.75</w:t>
+              <w:t>634.75</w:t>
             </w:r>
           </w:p>
         </w:tc>
@@ -28165,7 +28164,7 @@
             </w:pPr>
             <w:r/>
             <w:r>
-              <w:t>634.00</w:t>
+              <w:t>647.00</w:t>
             </w:r>
           </w:p>
         </w:tc>
@@ -28193,7 +28192,7 @@
             </w:pPr>
             <w:r/>
             <w:r>
-              <w:t>607.50</w:t>
+              <w:t>620.50</w:t>
             </w:r>
           </w:p>
         </w:tc>
@@ -28224,7 +28223,7 @@
               <w:rPr>
                 <w:b/>
               </w:rPr>
-              <w:t>620.25</w:t>
+              <w:t>633.25</w:t>
             </w:r>
           </w:p>
         </w:tc>
@@ -28372,7 +28371,7 @@
             </w:pPr>
             <w:r/>
             <w:r>
-              <w:t>620.25</w:t>
+              <w:t>633.25</w:t>
             </w:r>
           </w:p>
         </w:tc>
@@ -28400,7 +28399,7 @@
             </w:pPr>
             <w:r/>
             <w:r>
-              <w:t>627.25</w:t>
+              <w:t>640.25</w:t>
             </w:r>
           </w:p>
         </w:tc>
@@ -28428,7 +28427,7 @@
             </w:pPr>
             <w:r/>
             <w:r>
-              <w:t>610.75</w:t>
+              <w:t>623.75</w:t>
             </w:r>
           </w:p>
         </w:tc>
@@ -28459,7 +28458,7 @@
               <w:rPr>
                 <w:b/>
               </w:rPr>
-              <w:t>620.75</w:t>
+              <w:t>633.75</w:t>
             </w:r>
           </w:p>
         </w:tc>
@@ -28607,7 +28606,7 @@
             </w:pPr>
             <w:r/>
             <w:r>
-              <w:t>620.75</w:t>
+              <w:t>633.75</w:t>
             </w:r>
           </w:p>
         </w:tc>
@@ -28635,7 +28634,7 @@
             </w:pPr>
             <w:r/>
             <w:r>
-              <w:t>631.25</w:t>
+              <w:t>644.25</w:t>
             </w:r>
           </w:p>
         </w:tc>
@@ -28663,7 +28662,7 @@
             </w:pPr>
             <w:r/>
             <w:r>
-              <w:t>613.50</w:t>
+              <w:t>626.50</w:t>
             </w:r>
           </w:p>
         </w:tc>
@@ -28694,7 +28693,7 @@
               <w:rPr>
                 <w:b/>
               </w:rPr>
-              <w:t>620.50</w:t>
+              <w:t>633.50</w:t>
             </w:r>
           </w:p>
         </w:tc>
@@ -28842,7 +28841,7 @@
             </w:pPr>
             <w:r/>
             <w:r>
-              <w:t>620.50</w:t>
+              <w:t>633.50</w:t>
             </w:r>
           </w:p>
         </w:tc>
@@ -28870,7 +28869,7 @@
             </w:pPr>
             <w:r/>
             <w:r>
-              <w:t>630.25</w:t>
+              <w:t>643.25</w:t>
             </w:r>
           </w:p>
         </w:tc>
@@ -28898,7 +28897,7 @@
             </w:pPr>
             <w:r/>
             <w:r>
-              <w:t>610.75</w:t>
+              <w:t>623.75</w:t>
             </w:r>
           </w:p>
         </w:tc>
@@ -28929,7 +28928,7 @@
               <w:rPr>
                 <w:b/>
               </w:rPr>
-              <w:t>621.00</w:t>
+              <w:t>634.00</w:t>
             </w:r>
           </w:p>
         </w:tc>
@@ -29077,7 +29076,7 @@
             </w:pPr>
             <w:r/>
             <w:r>
-              <w:t>621.00</w:t>
+              <w:t>634.00</w:t>
             </w:r>
           </w:p>
         </w:tc>
@@ -29105,7 +29104,7 @@
             </w:pPr>
             <w:r/>
             <w:r>
-              <w:t>631.75</w:t>
+              <w:t>644.75</w:t>
             </w:r>
           </w:p>
         </w:tc>
@@ -29133,7 +29132,7 @@
             </w:pPr>
             <w:r/>
             <w:r>
-              <w:t>613.75</w:t>
+              <w:t>626.75</w:t>
             </w:r>
           </w:p>
         </w:tc>
@@ -29164,7 +29163,7 @@
               <w:rPr>
                 <w:b/>
               </w:rPr>
-              <w:t>621.75</w:t>
+              <w:t>634.75</w:t>
             </w:r>
           </w:p>
         </w:tc>
@@ -29312,7 +29311,7 @@
             </w:pPr>
             <w:r/>
             <w:r>
-              <w:t>621.75</w:t>
+              <w:t>634.75</w:t>
             </w:r>
           </w:p>
         </w:tc>
@@ -29340,7 +29339,7 @@
             </w:pPr>
             <w:r/>
             <w:r>
-              <w:t>628.25</w:t>
+              <w:t>641.25</w:t>
             </w:r>
           </w:p>
         </w:tc>
@@ -29368,7 +29367,7 @@
             </w:pPr>
             <w:r/>
             <w:r>
-              <w:t>613.25</w:t>
+              <w:t>626.25</w:t>
             </w:r>
           </w:p>
         </w:tc>
@@ -29399,7 +29398,7 @@
               <w:rPr>
                 <w:b/>
               </w:rPr>
-              <w:t>622.25</w:t>
+              <w:t>635.25</w:t>
             </w:r>
           </w:p>
         </w:tc>
@@ -29547,7 +29546,7 @@
             </w:pPr>
             <w:r/>
             <w:r>
-              <w:t>622.25</w:t>
+              <w:t>635.25</w:t>
             </w:r>
           </w:p>
         </w:tc>
@@ -29575,7 +29574,7 @@
             </w:pPr>
             <w:r/>
             <w:r>
-              <w:t>633.25</w:t>
+              <w:t>646.25</w:t>
             </w:r>
           </w:p>
         </w:tc>
@@ -29603,7 +29602,7 @@
             </w:pPr>
             <w:r/>
             <w:r>
-              <w:t>610.50</w:t>
+              <w:t>623.50</w:t>
             </w:r>
           </w:p>
         </w:tc>
@@ -29634,7 +29633,7 @@
               <w:rPr>
                 <w:b/>
               </w:rPr>
-              <w:t>625.75</w:t>
+              <w:t>638.75</w:t>
             </w:r>
           </w:p>
         </w:tc>
@@ -29782,7 +29781,7 @@
             </w:pPr>
             <w:r/>
             <w:r>
-              <w:t>625.75</w:t>
+              <w:t>638.75</w:t>
             </w:r>
           </w:p>
         </w:tc>
@@ -29810,7 +29809,7 @@
             </w:pPr>
             <w:r/>
             <w:r>
-              <w:t>631.25</w:t>
+              <w:t>644.25</w:t>
             </w:r>
           </w:p>
         </w:tc>
@@ -29838,7 +29837,7 @@
             </w:pPr>
             <w:r/>
             <w:r>
-              <w:t>618.00</w:t>
+              <w:t>631.00</w:t>
             </w:r>
           </w:p>
         </w:tc>
@@ -29869,7 +29868,7 @@
               <w:rPr>
                 <w:b/>
               </w:rPr>
-              <w:t>626.50</w:t>
+              <w:t>639.50</w:t>
             </w:r>
           </w:p>
         </w:tc>
@@ -30017,7 +30016,7 @@
             </w:pPr>
             <w:r/>
             <w:r>
-              <w:t>626.50</w:t>
+              <w:t>639.50</w:t>
             </w:r>
           </w:p>
         </w:tc>
@@ -30045,7 +30044,7 @@
             </w:pPr>
             <w:r/>
             <w:r>
-              <w:t>635.75</w:t>
+              <w:t>648.75</w:t>
             </w:r>
           </w:p>
         </w:tc>
@@ -30073,7 +30072,7 @@
             </w:pPr>
             <w:r/>
             <w:r>
-              <w:t>620.00</w:t>
+              <w:t>633.00</w:t>
             </w:r>
           </w:p>
         </w:tc>
@@ -30104,7 +30103,7 @@
               <w:rPr>
                 <w:b/>
               </w:rPr>
-              <w:t>625.75</w:t>
+              <w:t>638.75</w:t>
             </w:r>
           </w:p>
         </w:tc>
@@ -30252,7 +30251,7 @@
             </w:pPr>
             <w:r/>
             <w:r>
-              <w:t>625.75</w:t>
+              <w:t>638.75</w:t>
             </w:r>
           </w:p>
         </w:tc>
@@ -30280,7 +30279,7 @@
             </w:pPr>
             <w:r/>
             <w:r>
-              <w:t>633.25</w:t>
+              <w:t>646.25</w:t>
             </w:r>
           </w:p>
         </w:tc>
@@ -30308,7 +30307,7 @@
             </w:pPr>
             <w:r/>
             <w:r>
-              <w:t>619.75</w:t>
+              <w:t>632.75</w:t>
             </w:r>
           </w:p>
         </w:tc>
@@ -30339,7 +30338,7 @@
               <w:rPr>
                 <w:b/>
               </w:rPr>
-              <w:t>624.75</w:t>
+              <w:t>637.75</w:t>
             </w:r>
           </w:p>
         </w:tc>
@@ -30487,7 +30486,7 @@
             </w:pPr>
             <w:r/>
             <w:r>
-              <w:t>624.75</w:t>
+              <w:t>637.75</w:t>
             </w:r>
           </w:p>
         </w:tc>
@@ -30515,7 +30514,7 @@
             </w:pPr>
             <w:r/>
             <w:r>
-              <w:t>631.75</w:t>
+              <w:t>644.75</w:t>
             </w:r>
           </w:p>
         </w:tc>
@@ -30543,7 +30542,7 @@
             </w:pPr>
             <w:r/>
             <w:r>
-              <w:t>611.25</w:t>
+              <w:t>624.25</w:t>
             </w:r>
           </w:p>
         </w:tc>
@@ -30574,7 +30573,7 @@
               <w:rPr>
                 <w:b/>
               </w:rPr>
-              <w:t>625.50</w:t>
+              <w:t>638.50</w:t>
             </w:r>
           </w:p>
         </w:tc>
@@ -30722,7 +30721,7 @@
             </w:pPr>
             <w:r/>
             <w:r>
-              <w:t>625.50</w:t>
+              <w:t>638.50</w:t>
             </w:r>
           </w:p>
         </w:tc>
@@ -30750,7 +30749,7 @@
             </w:pPr>
             <w:r/>
             <w:r>
-              <w:t>634.75</w:t>
+              <w:t>647.75</w:t>
             </w:r>
           </w:p>
         </w:tc>
@@ -30778,7 +30777,7 @@
             </w:pPr>
             <w:r/>
             <w:r>
-              <w:t>618.25</w:t>
+              <w:t>631.25</w:t>
             </w:r>
           </w:p>
         </w:tc>
@@ -30809,7 +30808,7 @@
               <w:rPr>
                 <w:b/>
               </w:rPr>
-              <w:t>625.25</w:t>
+              <w:t>638.25</w:t>
             </w:r>
           </w:p>
         </w:tc>
@@ -30957,7 +30956,7 @@
             </w:pPr>
             <w:r/>
             <w:r>
-              <w:t>625.25</w:t>
+              <w:t>638.25</w:t>
             </w:r>
           </w:p>
         </w:tc>
@@ -30985,7 +30984,7 @@
             </w:pPr>
             <w:r/>
             <w:r>
-              <w:t>633.75</w:t>
+              <w:t>646.75</w:t>
             </w:r>
           </w:p>
         </w:tc>
@@ -31013,7 +31012,7 @@
             </w:pPr>
             <w:r/>
             <w:r>
-              <w:t>611.25</w:t>
+              <w:t>624.25</w:t>
             </w:r>
           </w:p>
         </w:tc>
@@ -31044,7 +31043,7 @@
               <w:rPr>
                 <w:b/>
               </w:rPr>
-              <w:t>627.00</w:t>
+              <w:t>640.00</w:t>
             </w:r>
           </w:p>
         </w:tc>
@@ -31192,7 +31191,7 @@
             </w:pPr>
             <w:r/>
             <w:r>
-              <w:t>627.00</w:t>
+              <w:t>640.00</w:t>
             </w:r>
           </w:p>
         </w:tc>
@@ -31220,7 +31219,7 @@
             </w:pPr>
             <w:r/>
             <w:r>
-              <w:t>633.25</w:t>
+              <w:t>646.25</w:t>
             </w:r>
           </w:p>
         </w:tc>
@@ -31248,7 +31247,7 @@
             </w:pPr>
             <w:r/>
             <w:r>
-              <w:t>620.50</w:t>
+              <w:t>633.50</w:t>
             </w:r>
           </w:p>
         </w:tc>
@@ -31279,7 +31278,7 @@
               <w:rPr>
                 <w:b/>
               </w:rPr>
-              <w:t>626.25</w:t>
+              <w:t>639.25</w:t>
             </w:r>
           </w:p>
         </w:tc>

</xml_diff>